<commit_message>
HIT-23 guide Timofey through independent review and update reviewer routing
</commit_message>
<xml_diff>
--- a/docs/labs/pr12/dk/reports/0104-pz01-dk.docx
+++ b/docs/labs/pr12/dk/reports/0104-pz01-dk.docx
@@ -860,6 +860,11 @@
       </w:r>
     </w:p>
     <w:p>
+      <w:r>
+        <w:t>19.10.2026 проверяющим назначен Тимофей Патрушев; назначение не является фактом проведённого review. Текущий порядок действий — review/TIMOFEY_REVIEW_GUIDE_RU.md.</w:t>
+      </w:r>
+    </w:p>
+    <w:p>
       <w:pPr>
         <w:pStyle w:val="1"/>
       </w:pPr>
@@ -1052,7 +1057,7 @@
                 <w:b w:val="0"/>
                 <w:sz w:val="20"/>
               </w:rPr>
-              <w:t>pr12-bootstrap-20261017-v2 → 94b78199c202a31bcb63326ae7f2a4748aa29360; bootstrap PR2 unmerged</w:t>
+              <w:t>pr12-bootstrap-20261017-v2 → 94b78199c202a31bcb63326ae7f2a4748aa29360; bootstrap PR #2 merged 19.10.2026 09:04 UTC</w:t>
             </w:r>
           </w:p>
         </w:tc>
@@ -1806,7 +1811,7 @@
     </w:p>
     <w:p>
       <w:r>
-        <w:t>HIT-19 → codex/HIT-19-dk-session-policy → PR14 → actual checks; HIT-20/21 добавляют consumer/tests в отдельных PR15/16. BootstrapPR2 и предшествующие requirementsPR12/13 unmerged, цепочка stacked честно. Реальное human review/merge ещё не выполнялись. Все source pins Candidate, не официальное Project OS admission. В main уже требуется отдельное approval, last-push approval и4strict checks; агент это не обходил.</w:t>
+        <w:t>HIT-19 → codex/HIT-19-dk-session-policy → PR14 → actual checks; HIT-20/21 добавляют consumer/tests в отдельных PR15/16. Общий bootstrap PR #2 merged 19.10.2026 09:04 UTC; собственные requirements PR #12/13 и code PR пока unmerged, цепочка stacked сохраняется. Реальное human review/merge ещё не выполнялись. Все source pins Candidate, не официальное Project OS admission. В main уже требуется отдельное approval, last-push approval и4strict checks; агент это не обходил.</w:t>
       </w:r>
     </w:p>
     <w:p>
@@ -2934,7 +2939,7 @@
     </w:p>
     <w:p>
       <w:r>
-        <w:t xml:space="preserve">DK должен лично проверить TP Processing на candidateadfbfc33bf20cb0b0641e49e48c0502d2f5d108d (PR10), NB — DK на2cd7c032e8ede98c75181599b440e97657bff197. Environment/fullSHA/commands/results/remarks/retest в review/peer-protocol.json. Сейчас </w:t>
+        <w:t xml:space="preserve">DK должен лично проверить TP Processing на candidateadfbfc33bf20cb0b0641e49e48c0502d2f5d108d (PR10), Тимофей Патрушев — DK на текущем head PR #19 с обязательной записью actual full SHA перед запуском. Environment/fullSHA/commands/results/remarks/retest в review/peer-protocol.json. Сейчас </w:t>
       </w:r>
       <w:r>
         <w:rPr>
@@ -2989,7 +2994,7 @@
     </w:p>
     <w:p>
       <w:r>
-        <w:t>Команды / действия: Дмитрий лично клонирует TP exact candidate в чистую среду и выполняет validate/check processing/smoke processing по H1. После реального выполнения заполнить reviewer/date/env/fullSHA/argv/exit/remarks/retest в review/peer-protocol.json и показать свой terminal+protocol. Агент этого student action не выполнял. Для обратной стороны NB проверяет DK2cd7c03... отдельно.</w:t>
+        <w:t>Команды / действия: Дмитрий лично клонирует TP exact candidate в чистую среду и выполняет validate/check processing/smoke processing по H1. После реального выполнения заполнить reviewer/date/env/fullSHA/argv/exit/remarks/retest в review/peer-protocol.json и показать свой terminal+protocol. Агент этого student action не выполнял. Для обратной стороны Тимофей Патрушев проверяет DK в отдельном чистом checkout текущего head PR #19 и фиксирует actual SHA по review/TIMOFEY_REVIEW_GUIDE_RU.md.</w:t>
       </w:r>
     </w:p>
     <w:p>

</xml_diff>

<commit_message>
HIT-24: fix reviewed Go instructions and DOCX table pagination
</commit_message>
<xml_diff>
--- a/docs/labs/pr12/dk/reports/0104-pz01-dk.docx
+++ b/docs/labs/pr12/dk/reports/0104-pz01-dk.docx
@@ -861,7 +861,7 @@
     </w:p>
     <w:p>
       <w:r>
-        <w:t>19.10.2026 проверяющим назначен Тимофей Патрушев; назначение не является фактом проведённого review. Текущий порядок действий — review/TIMOFEY_REVIEW_GUIDE_RU.md.</w:t>
+        <w:t>19.10.2026 Tim1hik опубликовал ревью с пометкой «Codex по делегации Тимофея Патрушева»: код APPROVED_FOR_SCOPE (PR12–18), отчёты CHANGES_REQUIRED (PR19). Данная редакция исправляет DK-REV-001/002; авторская проверка и точные хеши — в review/corrections-20261019. По прямому решению Дмитрия повторный approval не требуется; merge допускается владельцем после проверок. Это не личная учебная взаимопроверка, не сдача и не формальная приёмка Project OS.</w:t>
       </w:r>
     </w:p>
     <w:p>
@@ -876,18 +876,28 @@
       <w:tblPr>
         <w:tblStyle w:val="af4"/>
         <w:tblW w:type="auto" w:w="0"/>
+        <w:tblLayout w:type="fixed"/>
         <w:tblLook w:firstColumn="1" w:firstRow="1" w:lastColumn="0" w:lastRow="0" w:noHBand="0" w:noVBand="1" w:val="04A0"/>
       </w:tblPr>
       <w:tblGrid>
-        <w:gridCol w:w="4677"/>
-        <w:gridCol w:w="4677"/>
+        <w:gridCol w:w="2619"/>
+        <w:gridCol w:w="6736"/>
       </w:tblGrid>
       <w:tr>
-        <w:tc>
-          <w:tcPr>
-            <w:tcW w:type="dxa" w:w="4677"/>
-          </w:tcPr>
-          <w:p>
+        <w:trPr>
+          <w:cantSplit/>
+          <w:tblHeader/>
+        </w:trPr>
+        <w:tc>
+          <w:tcPr>
+            <w:tcW w:type="dxa" w:w="2619"/>
+          </w:tcPr>
+          <w:p>
+            <w:pPr>
+              <w:spacing w:before="0" w:after="60" w:line="264" w:lineRule="auto"/>
+              <w:ind w:firstLine="0" w:left="0" w:right="0"/>
+              <w:jc w:val="left"/>
+            </w:pPr>
             <w:r>
               <w:rPr>
                 <w:b/>
@@ -899,9 +909,14 @@
         </w:tc>
         <w:tc>
           <w:tcPr>
-            <w:tcW w:type="dxa" w:w="4677"/>
-          </w:tcPr>
-          <w:p>
+            <w:tcW w:type="dxa" w:w="6736"/>
+          </w:tcPr>
+          <w:p>
+            <w:pPr>
+              <w:spacing w:before="0" w:after="60" w:line="264" w:lineRule="auto"/>
+              <w:ind w:firstLine="0" w:left="0" w:right="0"/>
+              <w:jc w:val="left"/>
+            </w:pPr>
             <w:r>
               <w:rPr>
                 <w:b/>
@@ -913,11 +928,19 @@
         </w:tc>
       </w:tr>
       <w:tr>
-        <w:tc>
-          <w:tcPr>
-            <w:tcW w:type="dxa" w:w="4677"/>
-          </w:tcPr>
-          <w:p>
+        <w:trPr>
+          <w:cantSplit/>
+        </w:trPr>
+        <w:tc>
+          <w:tcPr>
+            <w:tcW w:type="dxa" w:w="2619"/>
+          </w:tcPr>
+          <w:p>
+            <w:pPr>
+              <w:spacing w:before="0" w:after="60" w:line="264" w:lineRule="auto"/>
+              <w:ind w:firstLine="0" w:left="0" w:right="0"/>
+              <w:jc w:val="left"/>
+            </w:pPr>
             <w:r>
               <w:rPr>
                 <w:b w:val="0"/>
@@ -929,25 +952,38 @@
         </w:tc>
         <w:tc>
           <w:tcPr>
-            <w:tcW w:type="dxa" w:w="4677"/>
-          </w:tcPr>
-          <w:p>
-            <w:r>
-              <w:rPr>
-                <w:b w:val="0"/>
-                <w:sz w:val="20"/>
-              </w:rPr>
-              <w:t>Дмитрий Карачебан; код, проверки и текст подготовлены агентом Codex по прямому поручению, отдельный человек review ещё не выполнял</w:t>
+            <w:tcW w:type="dxa" w:w="6736"/>
+          </w:tcPr>
+          <w:p>
+            <w:pPr>
+              <w:spacing w:before="0" w:after="60" w:line="264" w:lineRule="auto"/>
+              <w:ind w:firstLine="0" w:left="0" w:right="0"/>
+              <w:jc w:val="left"/>
+            </w:pPr>
+            <w:r>
+              <w:rPr>
+                <w:b w:val="0"/>
+                <w:sz w:val="20"/>
+              </w:rPr>
+              <w:t>Дмитрий Карачебан; код, проверки и текст подготовлены Codex по поручению. Независимое техническое ревью выполнено Codex по делегации Тимофея; личные учебные проверки отдельно не засвидетельствованы</w:t>
             </w:r>
           </w:p>
         </w:tc>
       </w:tr>
       <w:tr>
-        <w:tc>
-          <w:tcPr>
-            <w:tcW w:type="dxa" w:w="4677"/>
-          </w:tcPr>
-          <w:p>
+        <w:trPr>
+          <w:cantSplit/>
+        </w:trPr>
+        <w:tc>
+          <w:tcPr>
+            <w:tcW w:type="dxa" w:w="2619"/>
+          </w:tcPr>
+          <w:p>
+            <w:pPr>
+              <w:spacing w:before="0" w:after="60" w:line="264" w:lineRule="auto"/>
+              <w:ind w:firstLine="0" w:left="0" w:right="0"/>
+              <w:jc w:val="left"/>
+            </w:pPr>
             <w:r>
               <w:rPr>
                 <w:b w:val="0"/>
@@ -959,9 +995,14 @@
         </w:tc>
         <w:tc>
           <w:tcPr>
-            <w:tcW w:type="dxa" w:w="4677"/>
-          </w:tcPr>
-          <w:p>
+            <w:tcW w:type="dxa" w:w="6736"/>
+          </w:tcPr>
+          <w:p>
+            <w:pPr>
+              <w:spacing w:before="0" w:after="60" w:line="264" w:lineRule="auto"/>
+              <w:ind w:firstLine="0" w:left="0" w:right="0"/>
+              <w:jc w:val="left"/>
+            </w:pPr>
             <w:r>
               <w:rPr>
                 <w:b w:val="0"/>
@@ -973,11 +1014,19 @@
         </w:tc>
       </w:tr>
       <w:tr>
-        <w:tc>
-          <w:tcPr>
-            <w:tcW w:type="dxa" w:w="4677"/>
-          </w:tcPr>
-          <w:p>
+        <w:trPr>
+          <w:cantSplit/>
+        </w:trPr>
+        <w:tc>
+          <w:tcPr>
+            <w:tcW w:type="dxa" w:w="2619"/>
+          </w:tcPr>
+          <w:p>
+            <w:pPr>
+              <w:spacing w:before="0" w:after="60" w:line="264" w:lineRule="auto"/>
+              <w:ind w:firstLine="0" w:left="0" w:right="0"/>
+              <w:jc w:val="left"/>
+            </w:pPr>
             <w:r>
               <w:rPr>
                 <w:b w:val="0"/>
@@ -989,9 +1038,14 @@
         </w:tc>
         <w:tc>
           <w:tcPr>
-            <w:tcW w:type="dxa" w:w="4677"/>
-          </w:tcPr>
-          <w:p>
+            <w:tcW w:type="dxa" w:w="6736"/>
+          </w:tcPr>
+          <w:p>
+            <w:pPr>
+              <w:spacing w:before="0" w:after="60" w:line="264" w:lineRule="auto"/>
+              <w:ind w:firstLine="0" w:left="0" w:right="0"/>
+              <w:jc w:val="left"/>
+            </w:pPr>
             <w:r>
               <w:rPr>
                 <w:b w:val="0"/>
@@ -1003,11 +1057,19 @@
         </w:tc>
       </w:tr>
       <w:tr>
-        <w:tc>
-          <w:tcPr>
-            <w:tcW w:type="dxa" w:w="4677"/>
-          </w:tcPr>
-          <w:p>
+        <w:trPr>
+          <w:cantSplit/>
+        </w:trPr>
+        <w:tc>
+          <w:tcPr>
+            <w:tcW w:type="dxa" w:w="2619"/>
+          </w:tcPr>
+          <w:p>
+            <w:pPr>
+              <w:spacing w:before="0" w:after="60" w:line="264" w:lineRule="auto"/>
+              <w:ind w:firstLine="0" w:left="0" w:right="0"/>
+              <w:jc w:val="left"/>
+            </w:pPr>
             <w:r>
               <w:rPr>
                 <w:b w:val="0"/>
@@ -1019,9 +1081,14 @@
         </w:tc>
         <w:tc>
           <w:tcPr>
-            <w:tcW w:type="dxa" w:w="4677"/>
-          </w:tcPr>
-          <w:p>
+            <w:tcW w:type="dxa" w:w="6736"/>
+          </w:tcPr>
+          <w:p>
+            <w:pPr>
+              <w:spacing w:before="0" w:after="60" w:line="264" w:lineRule="auto"/>
+              <w:ind w:firstLine="0" w:left="0" w:right="0"/>
+              <w:jc w:val="left"/>
+            </w:pPr>
             <w:r>
               <w:rPr>
                 <w:b w:val="0"/>
@@ -1033,11 +1100,19 @@
         </w:tc>
       </w:tr>
       <w:tr>
-        <w:tc>
-          <w:tcPr>
-            <w:tcW w:type="dxa" w:w="4677"/>
-          </w:tcPr>
-          <w:p>
+        <w:trPr>
+          <w:cantSplit/>
+        </w:trPr>
+        <w:tc>
+          <w:tcPr>
+            <w:tcW w:type="dxa" w:w="2619"/>
+          </w:tcPr>
+          <w:p>
+            <w:pPr>
+              <w:spacing w:before="0" w:after="60" w:line="264" w:lineRule="auto"/>
+              <w:ind w:firstLine="0" w:left="0" w:right="0"/>
+              <w:jc w:val="left"/>
+            </w:pPr>
             <w:r>
               <w:rPr>
                 <w:b w:val="0"/>
@@ -1049,9 +1124,14 @@
         </w:tc>
         <w:tc>
           <w:tcPr>
-            <w:tcW w:type="dxa" w:w="4677"/>
-          </w:tcPr>
-          <w:p>
+            <w:tcW w:type="dxa" w:w="6736"/>
+          </w:tcPr>
+          <w:p>
+            <w:pPr>
+              <w:spacing w:before="0" w:after="60" w:line="264" w:lineRule="auto"/>
+              <w:ind w:firstLine="0" w:left="0" w:right="0"/>
+              <w:jc w:val="left"/>
+            </w:pPr>
             <w:r>
               <w:rPr>
                 <w:b w:val="0"/>
@@ -1063,11 +1143,19 @@
         </w:tc>
       </w:tr>
       <w:tr>
-        <w:tc>
-          <w:tcPr>
-            <w:tcW w:type="dxa" w:w="4677"/>
-          </w:tcPr>
-          <w:p>
+        <w:trPr>
+          <w:cantSplit/>
+        </w:trPr>
+        <w:tc>
+          <w:tcPr>
+            <w:tcW w:type="dxa" w:w="2619"/>
+          </w:tcPr>
+          <w:p>
+            <w:pPr>
+              <w:spacing w:before="0" w:after="60" w:line="264" w:lineRule="auto"/>
+              <w:ind w:firstLine="0" w:left="0" w:right="0"/>
+              <w:jc w:val="left"/>
+            </w:pPr>
             <w:r>
               <w:rPr>
                 <w:b w:val="0"/>
@@ -1079,9 +1167,14 @@
         </w:tc>
         <w:tc>
           <w:tcPr>
-            <w:tcW w:type="dxa" w:w="4677"/>
-          </w:tcPr>
-          <w:p>
+            <w:tcW w:type="dxa" w:w="6736"/>
+          </w:tcPr>
+          <w:p>
+            <w:pPr>
+              <w:spacing w:before="0" w:after="60" w:line="264" w:lineRule="auto"/>
+              <w:ind w:firstLine="0" w:left="0" w:right="0"/>
+              <w:jc w:val="left"/>
+            </w:pPr>
             <w:r>
               <w:rPr>
                 <w:b w:val="0"/>
@@ -1093,11 +1186,19 @@
         </w:tc>
       </w:tr>
       <w:tr>
-        <w:tc>
-          <w:tcPr>
-            <w:tcW w:type="dxa" w:w="4677"/>
-          </w:tcPr>
-          <w:p>
+        <w:trPr>
+          <w:cantSplit/>
+        </w:trPr>
+        <w:tc>
+          <w:tcPr>
+            <w:tcW w:type="dxa" w:w="2619"/>
+          </w:tcPr>
+          <w:p>
+            <w:pPr>
+              <w:spacing w:before="0" w:after="60" w:line="264" w:lineRule="auto"/>
+              <w:ind w:firstLine="0" w:left="0" w:right="0"/>
+              <w:jc w:val="left"/>
+            </w:pPr>
             <w:r>
               <w:rPr>
                 <w:b w:val="0"/>
@@ -1109,9 +1210,14 @@
         </w:tc>
         <w:tc>
           <w:tcPr>
-            <w:tcW w:type="dxa" w:w="4677"/>
-          </w:tcPr>
-          <w:p>
+            <w:tcW w:type="dxa" w:w="6736"/>
+          </w:tcPr>
+          <w:p>
+            <w:pPr>
+              <w:spacing w:before="0" w:after="60" w:line="264" w:lineRule="auto"/>
+              <w:ind w:firstLine="0" w:left="0" w:right="0"/>
+              <w:jc w:val="left"/>
+            </w:pPr>
             <w:r>
               <w:rPr>
                 <w:b w:val="0"/>
@@ -1123,11 +1229,19 @@
         </w:tc>
       </w:tr>
       <w:tr>
-        <w:tc>
-          <w:tcPr>
-            <w:tcW w:type="dxa" w:w="4677"/>
-          </w:tcPr>
-          <w:p>
+        <w:trPr>
+          <w:cantSplit/>
+        </w:trPr>
+        <w:tc>
+          <w:tcPr>
+            <w:tcW w:type="dxa" w:w="2619"/>
+          </w:tcPr>
+          <w:p>
+            <w:pPr>
+              <w:spacing w:before="0" w:after="60" w:line="264" w:lineRule="auto"/>
+              <w:ind w:firstLine="0" w:left="0" w:right="0"/>
+              <w:jc w:val="left"/>
+            </w:pPr>
             <w:r>
               <w:rPr>
                 <w:b w:val="0"/>
@@ -1139,9 +1253,14 @@
         </w:tc>
         <w:tc>
           <w:tcPr>
-            <w:tcW w:type="dxa" w:w="4677"/>
-          </w:tcPr>
-          <w:p>
+            <w:tcW w:type="dxa" w:w="6736"/>
+          </w:tcPr>
+          <w:p>
+            <w:pPr>
+              <w:spacing w:before="0" w:after="60" w:line="264" w:lineRule="auto"/>
+              <w:ind w:firstLine="0" w:left="0" w:right="0"/>
+              <w:jc w:val="left"/>
+            </w:pPr>
             <w:r>
               <w:rPr>
                 <w:b w:val="0"/>
@@ -1153,11 +1272,19 @@
         </w:tc>
       </w:tr>
       <w:tr>
-        <w:tc>
-          <w:tcPr>
-            <w:tcW w:type="dxa" w:w="4677"/>
-          </w:tcPr>
-          <w:p>
+        <w:trPr>
+          <w:cantSplit/>
+        </w:trPr>
+        <w:tc>
+          <w:tcPr>
+            <w:tcW w:type="dxa" w:w="2619"/>
+          </w:tcPr>
+          <w:p>
+            <w:pPr>
+              <w:spacing w:before="0" w:after="60" w:line="264" w:lineRule="auto"/>
+              <w:ind w:firstLine="0" w:left="0" w:right="0"/>
+              <w:jc w:val="left"/>
+            </w:pPr>
             <w:r>
               <w:rPr>
                 <w:b w:val="0"/>
@@ -1169,9 +1296,14 @@
         </w:tc>
         <w:tc>
           <w:tcPr>
-            <w:tcW w:type="dxa" w:w="4677"/>
-          </w:tcPr>
-          <w:p>
+            <w:tcW w:type="dxa" w:w="6736"/>
+          </w:tcPr>
+          <w:p>
+            <w:pPr>
+              <w:spacing w:before="0" w:after="60" w:line="264" w:lineRule="auto"/>
+              <w:ind w:firstLine="0" w:left="0" w:right="0"/>
+              <w:jc w:val="left"/>
+            </w:pPr>
             <w:r>
               <w:rPr>
                 <w:b w:val="0"/>
@@ -1183,11 +1315,19 @@
         </w:tc>
       </w:tr>
       <w:tr>
-        <w:tc>
-          <w:tcPr>
-            <w:tcW w:type="dxa" w:w="4677"/>
-          </w:tcPr>
-          <w:p>
+        <w:trPr>
+          <w:cantSplit/>
+        </w:trPr>
+        <w:tc>
+          <w:tcPr>
+            <w:tcW w:type="dxa" w:w="2619"/>
+          </w:tcPr>
+          <w:p>
+            <w:pPr>
+              <w:spacing w:before="0" w:after="60" w:line="264" w:lineRule="auto"/>
+              <w:ind w:firstLine="0" w:left="0" w:right="0"/>
+              <w:jc w:val="left"/>
+            </w:pPr>
             <w:r>
               <w:rPr>
                 <w:b w:val="0"/>
@@ -1199,9 +1339,14 @@
         </w:tc>
         <w:tc>
           <w:tcPr>
-            <w:tcW w:type="dxa" w:w="4677"/>
-          </w:tcPr>
-          <w:p>
+            <w:tcW w:type="dxa" w:w="6736"/>
+          </w:tcPr>
+          <w:p>
+            <w:pPr>
+              <w:spacing w:before="0" w:after="60" w:line="264" w:lineRule="auto"/>
+              <w:ind w:firstLine="0" w:left="0" w:right="0"/>
+              <w:jc w:val="left"/>
+            </w:pPr>
             <w:r>
               <w:rPr>
                 <w:b w:val="0"/>
@@ -1213,11 +1358,19 @@
         </w:tc>
       </w:tr>
       <w:tr>
-        <w:tc>
-          <w:tcPr>
-            <w:tcW w:type="dxa" w:w="4677"/>
-          </w:tcPr>
-          <w:p>
+        <w:trPr>
+          <w:cantSplit/>
+        </w:trPr>
+        <w:tc>
+          <w:tcPr>
+            <w:tcW w:type="dxa" w:w="2619"/>
+          </w:tcPr>
+          <w:p>
+            <w:pPr>
+              <w:spacing w:before="0" w:after="60" w:line="264" w:lineRule="auto"/>
+              <w:ind w:firstLine="0" w:left="0" w:right="0"/>
+              <w:jc w:val="left"/>
+            </w:pPr>
             <w:r>
               <w:rPr>
                 <w:b w:val="0"/>
@@ -1229,9 +1382,14 @@
         </w:tc>
         <w:tc>
           <w:tcPr>
-            <w:tcW w:type="dxa" w:w="4677"/>
-          </w:tcPr>
-          <w:p>
+            <w:tcW w:type="dxa" w:w="6736"/>
+          </w:tcPr>
+          <w:p>
+            <w:pPr>
+              <w:spacing w:before="0" w:after="60" w:line="264" w:lineRule="auto"/>
+              <w:ind w:firstLine="0" w:left="0" w:right="0"/>
+              <w:jc w:val="left"/>
+            </w:pPr>
             <w:r>
               <w:rPr>
                 <w:b w:val="0"/>
@@ -1306,6 +1464,7 @@
       <w:tblPr>
         <w:tblStyle w:val="af4"/>
         <w:tblW w:type="auto" w:w="0"/>
+        <w:tblLayout w:type="fixed"/>
         <w:tblLook w:firstColumn="1" w:firstRow="1" w:lastColumn="0" w:lastRow="0" w:noHBand="0" w:noVBand="1" w:val="04A0"/>
       </w:tblPr>
       <w:tblGrid>
@@ -1315,11 +1474,20 @@
         <w:gridCol w:w="2339"/>
       </w:tblGrid>
       <w:tr>
+        <w:trPr>
+          <w:cantSplit/>
+          <w:tblHeader/>
+        </w:trPr>
         <w:tc>
           <w:tcPr>
             <w:tcW w:type="dxa" w:w="2339"/>
           </w:tcPr>
           <w:p>
+            <w:pPr>
+              <w:spacing w:before="0" w:after="60" w:line="264" w:lineRule="auto"/>
+              <w:ind w:firstLine="0" w:left="0" w:right="0"/>
+              <w:jc w:val="left"/>
+            </w:pPr>
             <w:r>
               <w:rPr>
                 <w:b/>
@@ -1334,6 +1502,11 @@
             <w:tcW w:type="dxa" w:w="2339"/>
           </w:tcPr>
           <w:p>
+            <w:pPr>
+              <w:spacing w:before="0" w:after="60" w:line="264" w:lineRule="auto"/>
+              <w:ind w:firstLine="0" w:left="0" w:right="0"/>
+              <w:jc w:val="left"/>
+            </w:pPr>
             <w:r>
               <w:rPr>
                 <w:b/>
@@ -1348,6 +1521,11 @@
             <w:tcW w:type="dxa" w:w="2339"/>
           </w:tcPr>
           <w:p>
+            <w:pPr>
+              <w:spacing w:before="0" w:after="60" w:line="264" w:lineRule="auto"/>
+              <w:ind w:firstLine="0" w:left="0" w:right="0"/>
+              <w:jc w:val="left"/>
+            </w:pPr>
             <w:r>
               <w:rPr>
                 <w:b/>
@@ -1362,6 +1540,11 @@
             <w:tcW w:type="dxa" w:w="2339"/>
           </w:tcPr>
           <w:p>
+            <w:pPr>
+              <w:spacing w:before="0" w:after="60" w:line="264" w:lineRule="auto"/>
+              <w:ind w:firstLine="0" w:left="0" w:right="0"/>
+              <w:jc w:val="left"/>
+            </w:pPr>
             <w:r>
               <w:rPr>
                 <w:b/>
@@ -1373,11 +1556,19 @@
         </w:tc>
       </w:tr>
       <w:tr>
+        <w:trPr>
+          <w:cantSplit/>
+        </w:trPr>
         <w:tc>
           <w:tcPr>
             <w:tcW w:type="dxa" w:w="2339"/>
           </w:tcPr>
           <w:p>
+            <w:pPr>
+              <w:spacing w:before="0" w:after="60" w:line="264" w:lineRule="auto"/>
+              <w:ind w:firstLine="0" w:left="0" w:right="0"/>
+              <w:jc w:val="left"/>
+            </w:pPr>
             <w:r>
               <w:rPr>
                 <w:b w:val="0"/>
@@ -1392,6 +1583,11 @@
             <w:tcW w:type="dxa" w:w="2339"/>
           </w:tcPr>
           <w:p>
+            <w:pPr>
+              <w:spacing w:before="0" w:after="60" w:line="264" w:lineRule="auto"/>
+              <w:ind w:firstLine="0" w:left="0" w:right="0"/>
+              <w:jc w:val="left"/>
+            </w:pPr>
             <w:r>
               <w:rPr>
                 <w:b w:val="0"/>
@@ -1406,6 +1602,11 @@
             <w:tcW w:type="dxa" w:w="2339"/>
           </w:tcPr>
           <w:p>
+            <w:pPr>
+              <w:spacing w:before="0" w:after="60" w:line="264" w:lineRule="auto"/>
+              <w:ind w:firstLine="0" w:left="0" w:right="0"/>
+              <w:jc w:val="left"/>
+            </w:pPr>
             <w:r>
               <w:rPr>
                 <w:b w:val="0"/>
@@ -1420,6 +1621,11 @@
             <w:tcW w:type="dxa" w:w="2339"/>
           </w:tcPr>
           <w:p>
+            <w:pPr>
+              <w:spacing w:before="0" w:after="60" w:line="264" w:lineRule="auto"/>
+              <w:ind w:firstLine="0" w:left="0" w:right="0"/>
+              <w:jc w:val="left"/>
+            </w:pPr>
             <w:r>
               <w:rPr>
                 <w:b w:val="0"/>
@@ -1431,11 +1637,19 @@
         </w:tc>
       </w:tr>
       <w:tr>
+        <w:trPr>
+          <w:cantSplit/>
+        </w:trPr>
         <w:tc>
           <w:tcPr>
             <w:tcW w:type="dxa" w:w="2339"/>
           </w:tcPr>
           <w:p>
+            <w:pPr>
+              <w:spacing w:before="0" w:after="60" w:line="264" w:lineRule="auto"/>
+              <w:ind w:firstLine="0" w:left="0" w:right="0"/>
+              <w:jc w:val="left"/>
+            </w:pPr>
             <w:r>
               <w:rPr>
                 <w:b w:val="0"/>
@@ -1450,6 +1664,11 @@
             <w:tcW w:type="dxa" w:w="2339"/>
           </w:tcPr>
           <w:p>
+            <w:pPr>
+              <w:spacing w:before="0" w:after="60" w:line="264" w:lineRule="auto"/>
+              <w:ind w:firstLine="0" w:left="0" w:right="0"/>
+              <w:jc w:val="left"/>
+            </w:pPr>
             <w:r>
               <w:rPr>
                 <w:b w:val="0"/>
@@ -1464,6 +1683,11 @@
             <w:tcW w:type="dxa" w:w="2339"/>
           </w:tcPr>
           <w:p>
+            <w:pPr>
+              <w:spacing w:before="0" w:after="60" w:line="264" w:lineRule="auto"/>
+              <w:ind w:firstLine="0" w:left="0" w:right="0"/>
+              <w:jc w:val="left"/>
+            </w:pPr>
             <w:r>
               <w:rPr>
                 <w:b w:val="0"/>
@@ -1478,6 +1702,11 @@
             <w:tcW w:type="dxa" w:w="2339"/>
           </w:tcPr>
           <w:p>
+            <w:pPr>
+              <w:spacing w:before="0" w:after="60" w:line="264" w:lineRule="auto"/>
+              <w:ind w:firstLine="0" w:left="0" w:right="0"/>
+              <w:jc w:val="left"/>
+            </w:pPr>
             <w:r>
               <w:rPr>
                 <w:b w:val="0"/>
@@ -1489,11 +1718,19 @@
         </w:tc>
       </w:tr>
       <w:tr>
+        <w:trPr>
+          <w:cantSplit/>
+        </w:trPr>
         <w:tc>
           <w:tcPr>
             <w:tcW w:type="dxa" w:w="2339"/>
           </w:tcPr>
           <w:p>
+            <w:pPr>
+              <w:spacing w:before="0" w:after="60" w:line="264" w:lineRule="auto"/>
+              <w:ind w:firstLine="0" w:left="0" w:right="0"/>
+              <w:jc w:val="left"/>
+            </w:pPr>
             <w:r>
               <w:rPr>
                 <w:b w:val="0"/>
@@ -1508,6 +1745,11 @@
             <w:tcW w:type="dxa" w:w="2339"/>
           </w:tcPr>
           <w:p>
+            <w:pPr>
+              <w:spacing w:before="0" w:after="60" w:line="264" w:lineRule="auto"/>
+              <w:ind w:firstLine="0" w:left="0" w:right="0"/>
+              <w:jc w:val="left"/>
+            </w:pPr>
             <w:r>
               <w:rPr>
                 <w:b w:val="0"/>
@@ -1522,6 +1764,11 @@
             <w:tcW w:type="dxa" w:w="2339"/>
           </w:tcPr>
           <w:p>
+            <w:pPr>
+              <w:spacing w:before="0" w:after="60" w:line="264" w:lineRule="auto"/>
+              <w:ind w:firstLine="0" w:left="0" w:right="0"/>
+              <w:jc w:val="left"/>
+            </w:pPr>
             <w:r>
               <w:rPr>
                 <w:b w:val="0"/>
@@ -1536,6 +1783,11 @@
             <w:tcW w:type="dxa" w:w="2339"/>
           </w:tcPr>
           <w:p>
+            <w:pPr>
+              <w:spacing w:before="0" w:after="60" w:line="264" w:lineRule="auto"/>
+              <w:ind w:firstLine="0" w:left="0" w:right="0"/>
+              <w:jc w:val="left"/>
+            </w:pPr>
             <w:r>
               <w:rPr>
                 <w:b w:val="0"/>
@@ -1547,11 +1799,19 @@
         </w:tc>
       </w:tr>
       <w:tr>
+        <w:trPr>
+          <w:cantSplit/>
+        </w:trPr>
         <w:tc>
           <w:tcPr>
             <w:tcW w:type="dxa" w:w="2339"/>
           </w:tcPr>
           <w:p>
+            <w:pPr>
+              <w:spacing w:before="0" w:after="60" w:line="264" w:lineRule="auto"/>
+              <w:ind w:firstLine="0" w:left="0" w:right="0"/>
+              <w:jc w:val="left"/>
+            </w:pPr>
             <w:r>
               <w:rPr>
                 <w:b w:val="0"/>
@@ -1566,6 +1826,11 @@
             <w:tcW w:type="dxa" w:w="2339"/>
           </w:tcPr>
           <w:p>
+            <w:pPr>
+              <w:spacing w:before="0" w:after="60" w:line="264" w:lineRule="auto"/>
+              <w:ind w:firstLine="0" w:left="0" w:right="0"/>
+              <w:jc w:val="left"/>
+            </w:pPr>
             <w:r>
               <w:rPr>
                 <w:b w:val="0"/>
@@ -1580,6 +1845,11 @@
             <w:tcW w:type="dxa" w:w="2339"/>
           </w:tcPr>
           <w:p>
+            <w:pPr>
+              <w:spacing w:before="0" w:after="60" w:line="264" w:lineRule="auto"/>
+              <w:ind w:firstLine="0" w:left="0" w:right="0"/>
+              <w:jc w:val="left"/>
+            </w:pPr>
             <w:r>
               <w:rPr>
                 <w:b w:val="0"/>
@@ -1594,6 +1864,11 @@
             <w:tcW w:type="dxa" w:w="2339"/>
           </w:tcPr>
           <w:p>
+            <w:pPr>
+              <w:spacing w:before="0" w:after="60" w:line="264" w:lineRule="auto"/>
+              <w:ind w:firstLine="0" w:left="0" w:right="0"/>
+              <w:jc w:val="left"/>
+            </w:pPr>
             <w:r>
               <w:rPr>
                 <w:b w:val="0"/>
@@ -1605,11 +1880,19 @@
         </w:tc>
       </w:tr>
       <w:tr>
+        <w:trPr>
+          <w:cantSplit/>
+        </w:trPr>
         <w:tc>
           <w:tcPr>
             <w:tcW w:type="dxa" w:w="2339"/>
           </w:tcPr>
           <w:p>
+            <w:pPr>
+              <w:spacing w:before="0" w:after="60" w:line="264" w:lineRule="auto"/>
+              <w:ind w:firstLine="0" w:left="0" w:right="0"/>
+              <w:jc w:val="left"/>
+            </w:pPr>
             <w:r>
               <w:rPr>
                 <w:b w:val="0"/>
@@ -1624,6 +1907,11 @@
             <w:tcW w:type="dxa" w:w="2339"/>
           </w:tcPr>
           <w:p>
+            <w:pPr>
+              <w:spacing w:before="0" w:after="60" w:line="264" w:lineRule="auto"/>
+              <w:ind w:firstLine="0" w:left="0" w:right="0"/>
+              <w:jc w:val="left"/>
+            </w:pPr>
             <w:r>
               <w:rPr>
                 <w:b w:val="0"/>
@@ -1638,6 +1926,11 @@
             <w:tcW w:type="dxa" w:w="2339"/>
           </w:tcPr>
           <w:p>
+            <w:pPr>
+              <w:spacing w:before="0" w:after="60" w:line="264" w:lineRule="auto"/>
+              <w:ind w:firstLine="0" w:left="0" w:right="0"/>
+              <w:jc w:val="left"/>
+            </w:pPr>
             <w:r>
               <w:rPr>
                 <w:b w:val="0"/>
@@ -1652,6 +1945,11 @@
             <w:tcW w:type="dxa" w:w="2339"/>
           </w:tcPr>
           <w:p>
+            <w:pPr>
+              <w:spacing w:before="0" w:after="60" w:line="264" w:lineRule="auto"/>
+              <w:ind w:firstLine="0" w:left="0" w:right="0"/>
+              <w:jc w:val="left"/>
+            </w:pPr>
             <w:r>
               <w:rPr>
                 <w:b w:val="0"/>
@@ -1663,11 +1961,19 @@
         </w:tc>
       </w:tr>
       <w:tr>
+        <w:trPr>
+          <w:cantSplit/>
+        </w:trPr>
         <w:tc>
           <w:tcPr>
             <w:tcW w:type="dxa" w:w="2339"/>
           </w:tcPr>
           <w:p>
+            <w:pPr>
+              <w:spacing w:before="0" w:after="60" w:line="264" w:lineRule="auto"/>
+              <w:ind w:firstLine="0" w:left="0" w:right="0"/>
+              <w:jc w:val="left"/>
+            </w:pPr>
             <w:r>
               <w:rPr>
                 <w:b w:val="0"/>
@@ -1682,6 +1988,11 @@
             <w:tcW w:type="dxa" w:w="2339"/>
           </w:tcPr>
           <w:p>
+            <w:pPr>
+              <w:spacing w:before="0" w:after="60" w:line="264" w:lineRule="auto"/>
+              <w:ind w:firstLine="0" w:left="0" w:right="0"/>
+              <w:jc w:val="left"/>
+            </w:pPr>
             <w:r>
               <w:rPr>
                 <w:b w:val="0"/>
@@ -1696,6 +2007,11 @@
             <w:tcW w:type="dxa" w:w="2339"/>
           </w:tcPr>
           <w:p>
+            <w:pPr>
+              <w:spacing w:before="0" w:after="60" w:line="264" w:lineRule="auto"/>
+              <w:ind w:firstLine="0" w:left="0" w:right="0"/>
+              <w:jc w:val="left"/>
+            </w:pPr>
             <w:r>
               <w:rPr>
                 <w:b w:val="0"/>
@@ -1710,6 +2026,11 @@
             <w:tcW w:type="dxa" w:w="2339"/>
           </w:tcPr>
           <w:p>
+            <w:pPr>
+              <w:spacing w:before="0" w:after="60" w:line="264" w:lineRule="auto"/>
+              <w:ind w:firstLine="0" w:left="0" w:right="0"/>
+              <w:jc w:val="left"/>
+            </w:pPr>
             <w:r>
               <w:rPr>
                 <w:b w:val="0"/>
@@ -1721,11 +2042,19 @@
         </w:tc>
       </w:tr>
       <w:tr>
+        <w:trPr>
+          <w:cantSplit/>
+        </w:trPr>
         <w:tc>
           <w:tcPr>
             <w:tcW w:type="dxa" w:w="2339"/>
           </w:tcPr>
           <w:p>
+            <w:pPr>
+              <w:spacing w:before="0" w:after="60" w:line="264" w:lineRule="auto"/>
+              <w:ind w:firstLine="0" w:left="0" w:right="0"/>
+              <w:jc w:val="left"/>
+            </w:pPr>
             <w:r>
               <w:rPr>
                 <w:b w:val="0"/>
@@ -1740,6 +2069,11 @@
             <w:tcW w:type="dxa" w:w="2339"/>
           </w:tcPr>
           <w:p>
+            <w:pPr>
+              <w:spacing w:before="0" w:after="60" w:line="264" w:lineRule="auto"/>
+              <w:ind w:firstLine="0" w:left="0" w:right="0"/>
+              <w:jc w:val="left"/>
+            </w:pPr>
             <w:r>
               <w:rPr>
                 <w:b w:val="0"/>
@@ -1754,6 +2088,11 @@
             <w:tcW w:type="dxa" w:w="2339"/>
           </w:tcPr>
           <w:p>
+            <w:pPr>
+              <w:spacing w:before="0" w:after="60" w:line="264" w:lineRule="auto"/>
+              <w:ind w:firstLine="0" w:left="0" w:right="0"/>
+              <w:jc w:val="left"/>
+            </w:pPr>
             <w:r>
               <w:rPr>
                 <w:b w:val="0"/>
@@ -1768,6 +2107,11 @@
             <w:tcW w:type="dxa" w:w="2339"/>
           </w:tcPr>
           <w:p>
+            <w:pPr>
+              <w:spacing w:before="0" w:after="60" w:line="264" w:lineRule="auto"/>
+              <w:ind w:firstLine="0" w:left="0" w:right="0"/>
+              <w:jc w:val="left"/>
+            </w:pPr>
             <w:r>
               <w:rPr>
                 <w:b w:val="0"/>
@@ -1811,7 +2155,7 @@
     </w:p>
     <w:p>
       <w:r>
-        <w:t>HIT-19 → codex/HIT-19-dk-session-policy → PR14 → actual checks; HIT-20/21 добавляют consumer/tests в отдельных PR15/16. Общий bootstrap PR #2 merged 19.10.2026 09:04 UTC; собственные requirements PR #12/13 и code PR пока unmerged, цепочка stacked сохраняется. Реальное human review/merge ещё не выполнялись. Все source pins Candidate, не официальное Project OS admission. В main уже требуется отдельное approval, last-push approval и4strict checks; агент это не обходил.</w:t>
+        <w:t>HIT-19 → codex/HIT-19-dk-session-policy → PR14 → actual checks; HIT-20/21 добавляют consumer/tests в отдельных PR15/16. На момент подготовки 18/19 октября общий bootstrap PR #2 уже merged, а собственные PR были stacked и unmerged. Текущее техническое ревью и решение об интеграции приведены во введении; фактический merge устанавливается по GitHub, а не по этому историческому снимку. Все source pins Candidate, не официальное Project OS admission. В main действуют approval, last-push approval и четыре strict checks. Владелец отдельно разрешил bypass повторного approval после авторского исправления замечаний; обязательные CI не обходятся.</w:t>
       </w:r>
     </w:p>
     <w:p>
@@ -1940,6 +2284,7 @@
       <w:tblPr>
         <w:tblStyle w:val="af4"/>
         <w:tblW w:type="auto" w:w="0"/>
+        <w:tblLayout w:type="fixed"/>
         <w:tblLook w:firstColumn="1" w:firstRow="1" w:lastColumn="0" w:lastRow="0" w:noHBand="0" w:noVBand="1" w:val="04A0"/>
       </w:tblPr>
       <w:tblGrid>
@@ -1948,11 +2293,20 @@
         <w:gridCol w:w="3118"/>
       </w:tblGrid>
       <w:tr>
+        <w:trPr>
+          <w:cantSplit/>
+          <w:tblHeader/>
+        </w:trPr>
         <w:tc>
           <w:tcPr>
             <w:tcW w:type="dxa" w:w="3118"/>
           </w:tcPr>
           <w:p>
+            <w:pPr>
+              <w:spacing w:before="0" w:after="60" w:line="264" w:lineRule="auto"/>
+              <w:ind w:firstLine="0" w:left="0" w:right="0"/>
+              <w:jc w:val="left"/>
+            </w:pPr>
             <w:r>
               <w:rPr>
                 <w:b/>
@@ -1967,6 +2321,11 @@
             <w:tcW w:type="dxa" w:w="3118"/>
           </w:tcPr>
           <w:p>
+            <w:pPr>
+              <w:spacing w:before="0" w:after="60" w:line="264" w:lineRule="auto"/>
+              <w:ind w:firstLine="0" w:left="0" w:right="0"/>
+              <w:jc w:val="left"/>
+            </w:pPr>
             <w:r>
               <w:rPr>
                 <w:b/>
@@ -1981,6 +2340,11 @@
             <w:tcW w:type="dxa" w:w="3118"/>
           </w:tcPr>
           <w:p>
+            <w:pPr>
+              <w:spacing w:before="0" w:after="60" w:line="264" w:lineRule="auto"/>
+              <w:ind w:firstLine="0" w:left="0" w:right="0"/>
+              <w:jc w:val="left"/>
+            </w:pPr>
             <w:r>
               <w:rPr>
                 <w:b/>
@@ -1992,11 +2356,19 @@
         </w:tc>
       </w:tr>
       <w:tr>
+        <w:trPr>
+          <w:cantSplit/>
+        </w:trPr>
         <w:tc>
           <w:tcPr>
             <w:tcW w:type="dxa" w:w="3118"/>
           </w:tcPr>
           <w:p>
+            <w:pPr>
+              <w:spacing w:before="0" w:after="60" w:line="264" w:lineRule="auto"/>
+              <w:ind w:firstLine="0" w:left="0" w:right="0"/>
+              <w:jc w:val="left"/>
+            </w:pPr>
             <w:r>
               <w:rPr>
                 <w:b w:val="0"/>
@@ -2011,6 +2383,11 @@
             <w:tcW w:type="dxa" w:w="3118"/>
           </w:tcPr>
           <w:p>
+            <w:pPr>
+              <w:spacing w:before="0" w:after="60" w:line="264" w:lineRule="auto"/>
+              <w:ind w:firstLine="0" w:left="0" w:right="0"/>
+              <w:jc w:val="left"/>
+            </w:pPr>
             <w:r>
               <w:rPr>
                 <w:b w:val="0"/>
@@ -2025,6 +2402,11 @@
             <w:tcW w:type="dxa" w:w="3118"/>
           </w:tcPr>
           <w:p>
+            <w:pPr>
+              <w:spacing w:before="0" w:after="60" w:line="264" w:lineRule="auto"/>
+              <w:ind w:firstLine="0" w:left="0" w:right="0"/>
+              <w:jc w:val="left"/>
+            </w:pPr>
             <w:r>
               <w:rPr>
                 <w:b w:val="0"/>
@@ -2036,11 +2418,19 @@
         </w:tc>
       </w:tr>
       <w:tr>
+        <w:trPr>
+          <w:cantSplit/>
+        </w:trPr>
         <w:tc>
           <w:tcPr>
             <w:tcW w:type="dxa" w:w="3118"/>
           </w:tcPr>
           <w:p>
+            <w:pPr>
+              <w:spacing w:before="0" w:after="60" w:line="264" w:lineRule="auto"/>
+              <w:ind w:firstLine="0" w:left="0" w:right="0"/>
+              <w:jc w:val="left"/>
+            </w:pPr>
             <w:r>
               <w:rPr>
                 <w:b w:val="0"/>
@@ -2055,6 +2445,11 @@
             <w:tcW w:type="dxa" w:w="3118"/>
           </w:tcPr>
           <w:p>
+            <w:pPr>
+              <w:spacing w:before="0" w:after="60" w:line="264" w:lineRule="auto"/>
+              <w:ind w:firstLine="0" w:left="0" w:right="0"/>
+              <w:jc w:val="left"/>
+            </w:pPr>
             <w:r>
               <w:rPr>
                 <w:b w:val="0"/>
@@ -2069,6 +2464,11 @@
             <w:tcW w:type="dxa" w:w="3118"/>
           </w:tcPr>
           <w:p>
+            <w:pPr>
+              <w:spacing w:before="0" w:after="60" w:line="264" w:lineRule="auto"/>
+              <w:ind w:firstLine="0" w:left="0" w:right="0"/>
+              <w:jc w:val="left"/>
+            </w:pPr>
             <w:r>
               <w:rPr>
                 <w:b w:val="0"/>
@@ -2080,11 +2480,19 @@
         </w:tc>
       </w:tr>
       <w:tr>
+        <w:trPr>
+          <w:cantSplit/>
+        </w:trPr>
         <w:tc>
           <w:tcPr>
             <w:tcW w:type="dxa" w:w="3118"/>
           </w:tcPr>
           <w:p>
+            <w:pPr>
+              <w:spacing w:before="0" w:after="60" w:line="264" w:lineRule="auto"/>
+              <w:ind w:firstLine="0" w:left="0" w:right="0"/>
+              <w:jc w:val="left"/>
+            </w:pPr>
             <w:r>
               <w:rPr>
                 <w:b w:val="0"/>
@@ -2099,6 +2507,11 @@
             <w:tcW w:type="dxa" w:w="3118"/>
           </w:tcPr>
           <w:p>
+            <w:pPr>
+              <w:spacing w:before="0" w:after="60" w:line="264" w:lineRule="auto"/>
+              <w:ind w:firstLine="0" w:left="0" w:right="0"/>
+              <w:jc w:val="left"/>
+            </w:pPr>
             <w:r>
               <w:rPr>
                 <w:b w:val="0"/>
@@ -2113,6 +2526,11 @@
             <w:tcW w:type="dxa" w:w="3118"/>
           </w:tcPr>
           <w:p>
+            <w:pPr>
+              <w:spacing w:before="0" w:after="60" w:line="264" w:lineRule="auto"/>
+              <w:ind w:firstLine="0" w:left="0" w:right="0"/>
+              <w:jc w:val="left"/>
+            </w:pPr>
             <w:r>
               <w:rPr>
                 <w:b w:val="0"/>
@@ -2124,11 +2542,19 @@
         </w:tc>
       </w:tr>
       <w:tr>
+        <w:trPr>
+          <w:cantSplit/>
+        </w:trPr>
         <w:tc>
           <w:tcPr>
             <w:tcW w:type="dxa" w:w="3118"/>
           </w:tcPr>
           <w:p>
+            <w:pPr>
+              <w:spacing w:before="0" w:after="60" w:line="264" w:lineRule="auto"/>
+              <w:ind w:firstLine="0" w:left="0" w:right="0"/>
+              <w:jc w:val="left"/>
+            </w:pPr>
             <w:r>
               <w:rPr>
                 <w:b w:val="0"/>
@@ -2143,6 +2569,11 @@
             <w:tcW w:type="dxa" w:w="3118"/>
           </w:tcPr>
           <w:p>
+            <w:pPr>
+              <w:spacing w:before="0" w:after="60" w:line="264" w:lineRule="auto"/>
+              <w:ind w:firstLine="0" w:left="0" w:right="0"/>
+              <w:jc w:val="left"/>
+            </w:pPr>
             <w:r>
               <w:rPr>
                 <w:b w:val="0"/>
@@ -2157,6 +2588,11 @@
             <w:tcW w:type="dxa" w:w="3118"/>
           </w:tcPr>
           <w:p>
+            <w:pPr>
+              <w:spacing w:before="0" w:after="60" w:line="264" w:lineRule="auto"/>
+              <w:ind w:firstLine="0" w:left="0" w:right="0"/>
+              <w:jc w:val="left"/>
+            </w:pPr>
             <w:r>
               <w:rPr>
                 <w:b w:val="0"/>
@@ -2168,11 +2604,19 @@
         </w:tc>
       </w:tr>
       <w:tr>
+        <w:trPr>
+          <w:cantSplit/>
+        </w:trPr>
         <w:tc>
           <w:tcPr>
             <w:tcW w:type="dxa" w:w="3118"/>
           </w:tcPr>
           <w:p>
+            <w:pPr>
+              <w:spacing w:before="0" w:after="60" w:line="264" w:lineRule="auto"/>
+              <w:ind w:firstLine="0" w:left="0" w:right="0"/>
+              <w:jc w:val="left"/>
+            </w:pPr>
             <w:r>
               <w:rPr>
                 <w:b w:val="0"/>
@@ -2187,6 +2631,11 @@
             <w:tcW w:type="dxa" w:w="3118"/>
           </w:tcPr>
           <w:p>
+            <w:pPr>
+              <w:spacing w:before="0" w:after="60" w:line="264" w:lineRule="auto"/>
+              <w:ind w:firstLine="0" w:left="0" w:right="0"/>
+              <w:jc w:val="left"/>
+            </w:pPr>
             <w:r>
               <w:rPr>
                 <w:b w:val="0"/>
@@ -2201,6 +2650,11 @@
             <w:tcW w:type="dxa" w:w="3118"/>
           </w:tcPr>
           <w:p>
+            <w:pPr>
+              <w:spacing w:before="0" w:after="60" w:line="264" w:lineRule="auto"/>
+              <w:ind w:firstLine="0" w:left="0" w:right="0"/>
+              <w:jc w:val="left"/>
+            </w:pPr>
             <w:r>
               <w:rPr>
                 <w:b w:val="0"/>
@@ -2212,11 +2666,19 @@
         </w:tc>
       </w:tr>
       <w:tr>
+        <w:trPr>
+          <w:cantSplit/>
+        </w:trPr>
         <w:tc>
           <w:tcPr>
             <w:tcW w:type="dxa" w:w="3118"/>
           </w:tcPr>
           <w:p>
+            <w:pPr>
+              <w:spacing w:before="0" w:after="60" w:line="264" w:lineRule="auto"/>
+              <w:ind w:firstLine="0" w:left="0" w:right="0"/>
+              <w:jc w:val="left"/>
+            </w:pPr>
             <w:r>
               <w:rPr>
                 <w:b w:val="0"/>
@@ -2231,6 +2693,11 @@
             <w:tcW w:type="dxa" w:w="3118"/>
           </w:tcPr>
           <w:p>
+            <w:pPr>
+              <w:spacing w:before="0" w:after="60" w:line="264" w:lineRule="auto"/>
+              <w:ind w:firstLine="0" w:left="0" w:right="0"/>
+              <w:jc w:val="left"/>
+            </w:pPr>
             <w:r>
               <w:rPr>
                 <w:b w:val="0"/>
@@ -2245,6 +2712,11 @@
             <w:tcW w:type="dxa" w:w="3118"/>
           </w:tcPr>
           <w:p>
+            <w:pPr>
+              <w:spacing w:before="0" w:after="60" w:line="264" w:lineRule="auto"/>
+              <w:ind w:firstLine="0" w:left="0" w:right="0"/>
+              <w:jc w:val="left"/>
+            </w:pPr>
             <w:r>
               <w:rPr>
                 <w:b w:val="0"/>
@@ -2256,11 +2728,19 @@
         </w:tc>
       </w:tr>
       <w:tr>
+        <w:trPr>
+          <w:cantSplit/>
+        </w:trPr>
         <w:tc>
           <w:tcPr>
             <w:tcW w:type="dxa" w:w="3118"/>
           </w:tcPr>
           <w:p>
+            <w:pPr>
+              <w:spacing w:before="0" w:after="60" w:line="264" w:lineRule="auto"/>
+              <w:ind w:firstLine="0" w:left="0" w:right="0"/>
+              <w:jc w:val="left"/>
+            </w:pPr>
             <w:r>
               <w:rPr>
                 <w:b w:val="0"/>
@@ -2275,6 +2755,11 @@
             <w:tcW w:type="dxa" w:w="3118"/>
           </w:tcPr>
           <w:p>
+            <w:pPr>
+              <w:spacing w:before="0" w:after="60" w:line="264" w:lineRule="auto"/>
+              <w:ind w:firstLine="0" w:left="0" w:right="0"/>
+              <w:jc w:val="left"/>
+            </w:pPr>
             <w:r>
               <w:rPr>
                 <w:b w:val="0"/>
@@ -2289,6 +2774,11 @@
             <w:tcW w:type="dxa" w:w="3118"/>
           </w:tcPr>
           <w:p>
+            <w:pPr>
+              <w:spacing w:before="0" w:after="60" w:line="264" w:lineRule="auto"/>
+              <w:ind w:firstLine="0" w:left="0" w:right="0"/>
+              <w:jc w:val="left"/>
+            </w:pPr>
             <w:r>
               <w:rPr>
                 <w:b w:val="0"/>
@@ -2447,6 +2937,7 @@
       <w:tblPr>
         <w:tblStyle w:val="af4"/>
         <w:tblW w:type="auto" w:w="0"/>
+        <w:tblLayout w:type="fixed"/>
         <w:tblLook w:firstColumn="1" w:firstRow="1" w:lastColumn="0" w:lastRow="0" w:noHBand="0" w:noVBand="1" w:val="04A0"/>
       </w:tblPr>
       <w:tblGrid>
@@ -2455,11 +2946,20 @@
         <w:gridCol w:w="3118"/>
       </w:tblGrid>
       <w:tr>
+        <w:trPr>
+          <w:cantSplit/>
+          <w:tblHeader/>
+        </w:trPr>
         <w:tc>
           <w:tcPr>
             <w:tcW w:type="dxa" w:w="3118"/>
           </w:tcPr>
           <w:p>
+            <w:pPr>
+              <w:spacing w:before="0" w:after="60" w:line="264" w:lineRule="auto"/>
+              <w:ind w:firstLine="0" w:left="0" w:right="0"/>
+              <w:jc w:val="left"/>
+            </w:pPr>
             <w:r>
               <w:rPr>
                 <w:b/>
@@ -2474,6 +2974,11 @@
             <w:tcW w:type="dxa" w:w="3118"/>
           </w:tcPr>
           <w:p>
+            <w:pPr>
+              <w:spacing w:before="0" w:after="60" w:line="264" w:lineRule="auto"/>
+              <w:ind w:firstLine="0" w:left="0" w:right="0"/>
+              <w:jc w:val="left"/>
+            </w:pPr>
             <w:r>
               <w:rPr>
                 <w:b/>
@@ -2488,6 +2993,11 @@
             <w:tcW w:type="dxa" w:w="3118"/>
           </w:tcPr>
           <w:p>
+            <w:pPr>
+              <w:spacing w:before="0" w:after="60" w:line="264" w:lineRule="auto"/>
+              <w:ind w:firstLine="0" w:left="0" w:right="0"/>
+              <w:jc w:val="left"/>
+            </w:pPr>
             <w:r>
               <w:rPr>
                 <w:b/>
@@ -2499,11 +3009,19 @@
         </w:tc>
       </w:tr>
       <w:tr>
+        <w:trPr>
+          <w:cantSplit/>
+        </w:trPr>
         <w:tc>
           <w:tcPr>
             <w:tcW w:type="dxa" w:w="3118"/>
           </w:tcPr>
           <w:p>
+            <w:pPr>
+              <w:spacing w:before="0" w:after="60" w:line="264" w:lineRule="auto"/>
+              <w:ind w:firstLine="0" w:left="0" w:right="0"/>
+              <w:jc w:val="left"/>
+            </w:pPr>
             <w:r>
               <w:rPr>
                 <w:b w:val="0"/>
@@ -2518,6 +3036,11 @@
             <w:tcW w:type="dxa" w:w="3118"/>
           </w:tcPr>
           <w:p>
+            <w:pPr>
+              <w:spacing w:before="0" w:after="60" w:line="264" w:lineRule="auto"/>
+              <w:ind w:firstLine="0" w:left="0" w:right="0"/>
+              <w:jc w:val="left"/>
+            </w:pPr>
             <w:r>
               <w:rPr>
                 <w:b w:val="0"/>
@@ -2532,6 +3055,11 @@
             <w:tcW w:type="dxa" w:w="3118"/>
           </w:tcPr>
           <w:p>
+            <w:pPr>
+              <w:spacing w:before="0" w:after="60" w:line="264" w:lineRule="auto"/>
+              <w:ind w:firstLine="0" w:left="0" w:right="0"/>
+              <w:jc w:val="left"/>
+            </w:pPr>
             <w:r>
               <w:rPr>
                 <w:b w:val="0"/>
@@ -2543,11 +3071,19 @@
         </w:tc>
       </w:tr>
       <w:tr>
+        <w:trPr>
+          <w:cantSplit/>
+        </w:trPr>
         <w:tc>
           <w:tcPr>
             <w:tcW w:type="dxa" w:w="3118"/>
           </w:tcPr>
           <w:p>
+            <w:pPr>
+              <w:spacing w:before="0" w:after="60" w:line="264" w:lineRule="auto"/>
+              <w:ind w:firstLine="0" w:left="0" w:right="0"/>
+              <w:jc w:val="left"/>
+            </w:pPr>
             <w:r>
               <w:rPr>
                 <w:b w:val="0"/>
@@ -2562,6 +3098,11 @@
             <w:tcW w:type="dxa" w:w="3118"/>
           </w:tcPr>
           <w:p>
+            <w:pPr>
+              <w:spacing w:before="0" w:after="60" w:line="264" w:lineRule="auto"/>
+              <w:ind w:firstLine="0" w:left="0" w:right="0"/>
+              <w:jc w:val="left"/>
+            </w:pPr>
             <w:r>
               <w:rPr>
                 <w:b w:val="0"/>
@@ -2576,6 +3117,11 @@
             <w:tcW w:type="dxa" w:w="3118"/>
           </w:tcPr>
           <w:p>
+            <w:pPr>
+              <w:spacing w:before="0" w:after="60" w:line="264" w:lineRule="auto"/>
+              <w:ind w:firstLine="0" w:left="0" w:right="0"/>
+              <w:jc w:val="left"/>
+            </w:pPr>
             <w:r>
               <w:rPr>
                 <w:b w:val="0"/>
@@ -2587,11 +3133,19 @@
         </w:tc>
       </w:tr>
       <w:tr>
+        <w:trPr>
+          <w:cantSplit/>
+        </w:trPr>
         <w:tc>
           <w:tcPr>
             <w:tcW w:type="dxa" w:w="3118"/>
           </w:tcPr>
           <w:p>
+            <w:pPr>
+              <w:spacing w:before="0" w:after="60" w:line="264" w:lineRule="auto"/>
+              <w:ind w:firstLine="0" w:left="0" w:right="0"/>
+              <w:jc w:val="left"/>
+            </w:pPr>
             <w:r>
               <w:rPr>
                 <w:b w:val="0"/>
@@ -2606,6 +3160,11 @@
             <w:tcW w:type="dxa" w:w="3118"/>
           </w:tcPr>
           <w:p>
+            <w:pPr>
+              <w:spacing w:before="0" w:after="60" w:line="264" w:lineRule="auto"/>
+              <w:ind w:firstLine="0" w:left="0" w:right="0"/>
+              <w:jc w:val="left"/>
+            </w:pPr>
             <w:r>
               <w:rPr>
                 <w:b w:val="0"/>
@@ -2620,6 +3179,11 @@
             <w:tcW w:type="dxa" w:w="3118"/>
           </w:tcPr>
           <w:p>
+            <w:pPr>
+              <w:spacing w:before="0" w:after="60" w:line="264" w:lineRule="auto"/>
+              <w:ind w:firstLine="0" w:left="0" w:right="0"/>
+              <w:jc w:val="left"/>
+            </w:pPr>
             <w:r>
               <w:rPr>
                 <w:b w:val="0"/>
@@ -2631,11 +3195,19 @@
         </w:tc>
       </w:tr>
       <w:tr>
+        <w:trPr>
+          <w:cantSplit/>
+        </w:trPr>
         <w:tc>
           <w:tcPr>
             <w:tcW w:type="dxa" w:w="3118"/>
           </w:tcPr>
           <w:p>
+            <w:pPr>
+              <w:spacing w:before="0" w:after="60" w:line="264" w:lineRule="auto"/>
+              <w:ind w:firstLine="0" w:left="0" w:right="0"/>
+              <w:jc w:val="left"/>
+            </w:pPr>
             <w:r>
               <w:rPr>
                 <w:b w:val="0"/>
@@ -2650,6 +3222,11 @@
             <w:tcW w:type="dxa" w:w="3118"/>
           </w:tcPr>
           <w:p>
+            <w:pPr>
+              <w:spacing w:before="0" w:after="60" w:line="264" w:lineRule="auto"/>
+              <w:ind w:firstLine="0" w:left="0" w:right="0"/>
+              <w:jc w:val="left"/>
+            </w:pPr>
             <w:r>
               <w:rPr>
                 <w:b w:val="0"/>
@@ -2664,6 +3241,11 @@
             <w:tcW w:type="dxa" w:w="3118"/>
           </w:tcPr>
           <w:p>
+            <w:pPr>
+              <w:spacing w:before="0" w:after="60" w:line="264" w:lineRule="auto"/>
+              <w:ind w:firstLine="0" w:left="0" w:right="0"/>
+              <w:jc w:val="left"/>
+            </w:pPr>
             <w:r>
               <w:rPr>
                 <w:b w:val="0"/>
@@ -2675,11 +3257,19 @@
         </w:tc>
       </w:tr>
       <w:tr>
+        <w:trPr>
+          <w:cantSplit/>
+        </w:trPr>
         <w:tc>
           <w:tcPr>
             <w:tcW w:type="dxa" w:w="3118"/>
           </w:tcPr>
           <w:p>
+            <w:pPr>
+              <w:spacing w:before="0" w:after="60" w:line="264" w:lineRule="auto"/>
+              <w:ind w:firstLine="0" w:left="0" w:right="0"/>
+              <w:jc w:val="left"/>
+            </w:pPr>
             <w:r>
               <w:rPr>
                 <w:b w:val="0"/>
@@ -2694,6 +3284,11 @@
             <w:tcW w:type="dxa" w:w="3118"/>
           </w:tcPr>
           <w:p>
+            <w:pPr>
+              <w:spacing w:before="0" w:after="60" w:line="264" w:lineRule="auto"/>
+              <w:ind w:firstLine="0" w:left="0" w:right="0"/>
+              <w:jc w:val="left"/>
+            </w:pPr>
             <w:r>
               <w:rPr>
                 <w:b w:val="0"/>
@@ -2708,6 +3303,11 @@
             <w:tcW w:type="dxa" w:w="3118"/>
           </w:tcPr>
           <w:p>
+            <w:pPr>
+              <w:spacing w:before="0" w:after="60" w:line="264" w:lineRule="auto"/>
+              <w:ind w:firstLine="0" w:left="0" w:right="0"/>
+              <w:jc w:val="left"/>
+            </w:pPr>
             <w:r>
               <w:rPr>
                 <w:b w:val="0"/>
@@ -2719,11 +3319,19 @@
         </w:tc>
       </w:tr>
       <w:tr>
+        <w:trPr>
+          <w:cantSplit/>
+        </w:trPr>
         <w:tc>
           <w:tcPr>
             <w:tcW w:type="dxa" w:w="3118"/>
           </w:tcPr>
           <w:p>
+            <w:pPr>
+              <w:spacing w:before="0" w:after="60" w:line="264" w:lineRule="auto"/>
+              <w:ind w:firstLine="0" w:left="0" w:right="0"/>
+              <w:jc w:val="left"/>
+            </w:pPr>
             <w:r>
               <w:rPr>
                 <w:b w:val="0"/>
@@ -2738,6 +3346,11 @@
             <w:tcW w:type="dxa" w:w="3118"/>
           </w:tcPr>
           <w:p>
+            <w:pPr>
+              <w:spacing w:before="0" w:after="60" w:line="264" w:lineRule="auto"/>
+              <w:ind w:firstLine="0" w:left="0" w:right="0"/>
+              <w:jc w:val="left"/>
+            </w:pPr>
             <w:r>
               <w:rPr>
                 <w:b w:val="0"/>
@@ -2752,6 +3365,11 @@
             <w:tcW w:type="dxa" w:w="3118"/>
           </w:tcPr>
           <w:p>
+            <w:pPr>
+              <w:spacing w:before="0" w:after="60" w:line="264" w:lineRule="auto"/>
+              <w:ind w:firstLine="0" w:left="0" w:right="0"/>
+              <w:jc w:val="left"/>
+            </w:pPr>
             <w:r>
               <w:rPr>
                 <w:b w:val="0"/>
@@ -2763,11 +3381,19 @@
         </w:tc>
       </w:tr>
       <w:tr>
+        <w:trPr>
+          <w:cantSplit/>
+        </w:trPr>
         <w:tc>
           <w:tcPr>
             <w:tcW w:type="dxa" w:w="3118"/>
           </w:tcPr>
           <w:p>
+            <w:pPr>
+              <w:spacing w:before="0" w:after="60" w:line="264" w:lineRule="auto"/>
+              <w:ind w:firstLine="0" w:left="0" w:right="0"/>
+              <w:jc w:val="left"/>
+            </w:pPr>
             <w:r>
               <w:rPr>
                 <w:b w:val="0"/>
@@ -2782,6 +3408,11 @@
             <w:tcW w:type="dxa" w:w="3118"/>
           </w:tcPr>
           <w:p>
+            <w:pPr>
+              <w:spacing w:before="0" w:after="60" w:line="264" w:lineRule="auto"/>
+              <w:ind w:firstLine="0" w:left="0" w:right="0"/>
+              <w:jc w:val="left"/>
+            </w:pPr>
             <w:r>
               <w:rPr>
                 <w:b w:val="0"/>
@@ -2796,6 +3427,11 @@
             <w:tcW w:type="dxa" w:w="3118"/>
           </w:tcPr>
           <w:p>
+            <w:pPr>
+              <w:spacing w:before="0" w:after="60" w:line="264" w:lineRule="auto"/>
+              <w:ind w:firstLine="0" w:left="0" w:right="0"/>
+              <w:jc w:val="left"/>
+            </w:pPr>
             <w:r>
               <w:rPr>
                 <w:b w:val="0"/>
@@ -3134,7 +3770,7 @@
     </w:p>
     <w:p>
       <w:r>
-        <w:t>4. Собственные PR12–18, GitSHA/CI/logs/digests из evidence/index.json. Участок owner Дмитрий Карачебан; агентное исполнение Codex; независимый human review не проведён.</w:t>
+        <w:t>4. Собственные PR12–18, GitSHA/CI/logs/digests из evidence/index.json. Участок owner Дмитрий Карачебан; агентное исполнение Codex; техническое ревью Tim1hik проведено с объявленной делегацией, личные учебные действия не засвидетельствованы.</w:t>
       </w:r>
     </w:p>
     <w:p>

</xml_diff>